<commit_message>
Add both authors with registration numbers to the deck, README and report
</commit_message>
<xml_diff>
--- a/REPORT.docx
+++ b/REPORT.docx
@@ -16,7 +16,15 @@
         <w:pStyle w:val="FirstParagraph"/>
       </w:pPr>
       <w:r>
-        <w:t xml:space="preserve">Sahil Lenka and Kanishk Shukla, Recommender Systems</w:t>
+        <w:t xml:space="preserve">Sahil Lenka (2427010391) and Kanishk Shukla (2427010432)</w:t>
+      </w:r>
+    </w:p>
+    <w:p>
+      <w:pPr>
+        <w:pStyle w:val="BodyText"/>
+      </w:pPr>
+      <w:r>
+        <w:t xml:space="preserve">Recommender Systems, Manipal University Jaipur</w:t>
       </w:r>
     </w:p>
     <w:bookmarkStart w:id="20" w:name="problem"/>

</xml_diff>